<commit_message>
fix: renderiza termo de autorizacao oficial no pdf inline
</commit_message>
<xml_diff>
--- a/documentos/resources/termo_autorizacao.docx
+++ b/documentos/resources/termo_autorizacao.docx
@@ -3,23 +3,1385 @@
 <w:document xmlns:wpc="http://schemas.microsoft.com/office/word/2010/wordprocessingCanvas" xmlns:mo="http://schemas.microsoft.com/office/mac/office/2008/main" xmlns:mc="http://schemas.openxmlformats.org/markup-compatibility/2006" xmlns:mv="urn:schemas-microsoft-com:mac:vml" xmlns:o="urn:schemas-microsoft-com:office:office" xmlns:r="http://schemas.openxmlformats.org/officeDocument/2006/relationships" xmlns:m="http://schemas.openxmlformats.org/officeDocument/2006/math" xmlns:v="urn:schemas-microsoft-com:vml" xmlns:wp14="http://schemas.microsoft.com/office/word/2010/wordprocessingDrawing" xmlns:wp="http://schemas.openxmlformats.org/drawingml/2006/wordprocessingDrawing" xmlns:w10="urn:schemas-microsoft-com:office:word" xmlns:w="http://schemas.openxmlformats.org/wordprocessingml/2006/main" xmlns:w14="http://schemas.microsoft.com/office/word/2010/wordml" xmlns:wpg="http://schemas.microsoft.com/office/word/2010/wordprocessingGroup" xmlns:wpi="http://schemas.microsoft.com/office/word/2010/wordprocessingInk" xmlns:wne="http://schemas.microsoft.com/office/word/2006/wordml" xmlns:wps="http://schemas.microsoft.com/office/word/2010/wordprocessingShape" mc:Ignorable="w14 wp14">
   <w:body>
     <w:p>
+      <w:pPr>
+        <w:jc w:val="center"/>
+      </w:pPr>
       <w:r>
-        <w:t>TERMO — {{ termo.variante }}</w:t>
+        <w:rPr>
+          <w:rFonts w:ascii="Arial" w:hAnsi="Arial"/>
+          <w:b/>
+          <w:sz w:val="21"/>
+        </w:rPr>
+        <w:t>SECRETARIA DE ESTADO DA SEGURANCA PUBLICA</w:t>
       </w:r>
     </w:p>
     <w:p>
+      <w:pPr>
+        <w:jc w:val="center"/>
+      </w:pPr>
       <w:r>
-        <w:t>Participante: {{ termo.participante.nome }} — {{ termo.participante.cpf }}</w:t>
+        <w:rPr>
+          <w:rFonts w:ascii="Arial" w:hAnsi="Arial"/>
+          <w:b/>
+          <w:sz w:val="21"/>
+        </w:rPr>
+        <w:t>POLICIA CIVIL DO PARANA</w:t>
       </w:r>
     </w:p>
     <w:p>
+      <w:pPr>
+        <w:jc w:val="center"/>
+      </w:pPr>
       <w:r>
-        <w:t>Oficio {{ oficio.numero_formatado }}</w:t>
+        <w:rPr>
+          <w:rFonts w:ascii="Arial" w:hAnsi="Arial"/>
+          <w:b/>
+          <w:sz w:val="21"/>
+        </w:rPr>
+        <w:t>DEPARTAMENTO DA POLICIA CIVIL</w:t>
       </w:r>
     </w:p>
+    <w:p>
+      <w:pPr>
+        <w:jc w:val="center"/>
+      </w:pPr>
+      <w:r>
+        <w:rPr>
+          <w:rFonts w:ascii="Arial" w:hAnsi="Arial"/>
+          <w:b w:val="0"/>
+          <w:sz w:val="21"/>
+        </w:rPr>
+        <w:t>{{ institucional.unidade|default(termo.oficio.origem, true) }}</w:t>
+      </w:r>
+    </w:p>
+    <w:p>
+      <w:pPr>
+        <w:spacing w:before="280" w:after="240"/>
+        <w:jc w:val="center"/>
+      </w:pPr>
+      <w:r>
+        <w:rPr>
+          <w:rFonts w:ascii="Arial" w:hAnsi="Arial"/>
+          <w:b/>
+          <w:sz w:val="28"/>
+        </w:rPr>
+        <w:t>{{ termo.textos.titulo }}</w:t>
+      </w:r>
+    </w:p>
+    <w:p>
+      <w:pPr>
+        <w:spacing w:before="160" w:after="80"/>
+      </w:pPr>
+      <w:r>
+        <w:rPr>
+          <w:rFonts w:ascii="Arial" w:hAnsi="Arial"/>
+          <w:b/>
+          <w:sz w:val="21"/>
+        </w:rPr>
+        <w:t>IDENTIFICACAO DO OFICIO</w:t>
+      </w:r>
+    </w:p>
+    <w:tbl>
+      <w:tblPr>
+        <w:tblStyle w:val="TableGrid"/>
+        <w:tblW w:type="auto" w:w="0"/>
+        <w:jc w:val="center"/>
+        <w:tblLook w:firstColumn="1" w:firstRow="1" w:lastColumn="0" w:lastRow="0" w:noHBand="0" w:noVBand="1" w:val="04A0"/>
+      </w:tblPr>
+      <w:tblGrid>
+        <w:gridCol w:w="2422"/>
+        <w:gridCol w:w="2422"/>
+        <w:gridCol w:w="2422"/>
+        <w:gridCol w:w="2422"/>
+      </w:tblGrid>
+      <w:tr>
+        <w:tc>
+          <w:tcPr>
+            <w:tcW w:type="dxa" w:w="2422"/>
+            <w:vAlign w:val="top"/>
+          </w:tcPr>
+          <w:p>
+            <w:pPr>
+              <w:spacing w:after="0"/>
+            </w:pPr>
+            <w:r>
+              <w:rPr>
+                <w:rFonts w:ascii="Arial" w:hAnsi="Arial"/>
+                <w:b/>
+                <w:sz w:val="19"/>
+              </w:rPr>
+              <w:t>Numero</w:t>
+            </w:r>
+          </w:p>
+        </w:tc>
+        <w:tc>
+          <w:tcPr>
+            <w:tcW w:type="dxa" w:w="2422"/>
+            <w:vAlign w:val="top"/>
+          </w:tcPr>
+          <w:p>
+            <w:pPr>
+              <w:spacing w:after="0"/>
+            </w:pPr>
+            <w:r>
+              <w:rPr>
+                <w:rFonts w:ascii="Arial" w:hAnsi="Arial"/>
+                <w:sz w:val="19"/>
+              </w:rPr>
+              <w:t>{{ termo.oficio.numero_formatado }}</w:t>
+            </w:r>
+          </w:p>
+        </w:tc>
+        <w:tc>
+          <w:tcPr>
+            <w:tcW w:type="dxa" w:w="2422"/>
+            <w:vAlign w:val="top"/>
+          </w:tcPr>
+          <w:p>
+            <w:pPr>
+              <w:spacing w:after="0"/>
+            </w:pPr>
+            <w:r>
+              <w:rPr>
+                <w:rFonts w:ascii="Arial" w:hAnsi="Arial"/>
+                <w:b/>
+                <w:sz w:val="19"/>
+              </w:rPr>
+              <w:t>Data</w:t>
+            </w:r>
+          </w:p>
+        </w:tc>
+        <w:tc>
+          <w:tcPr>
+            <w:tcW w:type="dxa" w:w="2422"/>
+            <w:vAlign w:val="top"/>
+          </w:tcPr>
+          <w:p>
+            <w:pPr>
+              <w:spacing w:after="0"/>
+            </w:pPr>
+            <w:r>
+              <w:rPr>
+                <w:rFonts w:ascii="Arial" w:hAnsi="Arial"/>
+                <w:sz w:val="19"/>
+              </w:rPr>
+              <w:t>{{ termo.oficio.data_criacao }}</w:t>
+            </w:r>
+          </w:p>
+        </w:tc>
+      </w:tr>
+      <w:tr>
+        <w:tc>
+          <w:tcPr>
+            <w:tcW w:type="dxa" w:w="2422"/>
+            <w:vAlign w:val="top"/>
+          </w:tcPr>
+          <w:p>
+            <w:pPr>
+              <w:spacing w:after="0"/>
+            </w:pPr>
+            <w:r>
+              <w:rPr>
+                <w:rFonts w:ascii="Arial" w:hAnsi="Arial"/>
+                <w:b/>
+                <w:sz w:val="19"/>
+              </w:rPr>
+              <w:t>Protocolo</w:t>
+            </w:r>
+          </w:p>
+        </w:tc>
+        <w:tc>
+          <w:tcPr>
+            <w:tcW w:type="dxa" w:w="2422"/>
+            <w:vAlign w:val="top"/>
+          </w:tcPr>
+          <w:p>
+            <w:pPr>
+              <w:spacing w:after="0"/>
+            </w:pPr>
+            <w:r>
+              <w:rPr>
+                <w:rFonts w:ascii="Arial" w:hAnsi="Arial"/>
+                <w:sz w:val="19"/>
+              </w:rPr>
+              <w:t>{{ termo.oficio.protocolo_formatado }}</w:t>
+            </w:r>
+          </w:p>
+        </w:tc>
+        <w:tc>
+          <w:tcPr>
+            <w:tcW w:type="dxa" w:w="2422"/>
+            <w:vAlign w:val="top"/>
+          </w:tcPr>
+          <w:p>
+            <w:pPr>
+              <w:spacing w:after="0"/>
+            </w:pPr>
+            <w:r>
+              <w:rPr>
+                <w:rFonts w:ascii="Arial" w:hAnsi="Arial"/>
+                <w:b/>
+                <w:sz w:val="19"/>
+              </w:rPr>
+              <w:t>Origem</w:t>
+            </w:r>
+          </w:p>
+        </w:tc>
+        <w:tc>
+          <w:tcPr>
+            <w:tcW w:type="dxa" w:w="2422"/>
+            <w:vAlign w:val="top"/>
+          </w:tcPr>
+          <w:p>
+            <w:pPr>
+              <w:spacing w:after="0"/>
+            </w:pPr>
+            <w:r>
+              <w:rPr>
+                <w:rFonts w:ascii="Arial" w:hAnsi="Arial"/>
+                <w:sz w:val="19"/>
+              </w:rPr>
+              <w:t>{{ termo.oficio.origem }}</w:t>
+            </w:r>
+          </w:p>
+        </w:tc>
+      </w:tr>
+      <w:tr>
+        <w:tc>
+          <w:tcPr>
+            <w:tcW w:type="dxa" w:w="2422"/>
+            <w:vAlign w:val="top"/>
+          </w:tcPr>
+          <w:p>
+            <w:pPr>
+              <w:spacing w:after="0"/>
+            </w:pPr>
+            <w:r>
+              <w:rPr>
+                <w:rFonts w:ascii="Arial" w:hAnsi="Arial"/>
+                <w:b/>
+                <w:sz w:val="19"/>
+              </w:rPr>
+              <w:t>Destino</w:t>
+            </w:r>
+          </w:p>
+        </w:tc>
+        <w:tc>
+          <w:tcPr>
+            <w:tcW w:type="dxa" w:w="2422"/>
+            <w:vAlign w:val="top"/>
+          </w:tcPr>
+          <w:p>
+            <w:pPr>
+              <w:spacing w:after="0"/>
+            </w:pPr>
+            <w:r>
+              <w:rPr>
+                <w:rFonts w:ascii="Arial" w:hAnsi="Arial"/>
+                <w:sz w:val="19"/>
+              </w:rPr>
+              <w:t>{{ termo.oficio.destino }}</w:t>
+            </w:r>
+          </w:p>
+        </w:tc>
+        <w:tc>
+          <w:tcPr>
+            <w:tcW w:type="dxa" w:w="2422"/>
+            <w:vAlign w:val="top"/>
+          </w:tcPr>
+          <w:p>
+            <w:pPr>
+              <w:spacing w:after="0"/>
+            </w:pPr>
+            <w:r>
+              <w:rPr>
+                <w:rFonts w:ascii="Arial" w:hAnsi="Arial"/>
+                <w:b/>
+                <w:sz w:val="19"/>
+              </w:rPr>
+              <w:t>Assunto</w:t>
+            </w:r>
+          </w:p>
+        </w:tc>
+        <w:tc>
+          <w:tcPr>
+            <w:tcW w:type="dxa" w:w="2422"/>
+            <w:vAlign w:val="top"/>
+          </w:tcPr>
+          <w:p>
+            <w:pPr>
+              <w:spacing w:after="0"/>
+            </w:pPr>
+            <w:r>
+              <w:rPr>
+                <w:rFonts w:ascii="Arial" w:hAnsi="Arial"/>
+                <w:sz w:val="19"/>
+              </w:rPr>
+              <w:t>{{ termo.oficio.assunto }}</w:t>
+            </w:r>
+          </w:p>
+        </w:tc>
+      </w:tr>
+    </w:tbl>
+    <w:p>
+      <w:pPr>
+        <w:spacing w:before="160" w:after="80"/>
+      </w:pPr>
+      <w:r>
+        <w:rPr>
+          <w:rFonts w:ascii="Arial" w:hAnsi="Arial"/>
+          <w:b/>
+          <w:sz w:val="21"/>
+        </w:rPr>
+        <w:t>SERVIDOR PARTICIPANTE</w:t>
+      </w:r>
+    </w:p>
+    <w:tbl>
+      <w:tblPr>
+        <w:tblStyle w:val="TableGrid"/>
+        <w:tblW w:type="auto" w:w="0"/>
+        <w:jc w:val="center"/>
+        <w:tblLook w:firstColumn="1" w:firstRow="1" w:lastColumn="0" w:lastRow="0" w:noHBand="0" w:noVBand="1" w:val="04A0"/>
+      </w:tblPr>
+      <w:tblGrid>
+        <w:gridCol w:w="2422"/>
+        <w:gridCol w:w="2422"/>
+        <w:gridCol w:w="2422"/>
+        <w:gridCol w:w="2422"/>
+      </w:tblGrid>
+      <w:tr>
+        <w:tc>
+          <w:tcPr>
+            <w:tcW w:type="dxa" w:w="2422"/>
+            <w:vAlign w:val="top"/>
+          </w:tcPr>
+          <w:p>
+            <w:pPr>
+              <w:spacing w:after="0"/>
+            </w:pPr>
+            <w:r>
+              <w:rPr>
+                <w:rFonts w:ascii="Arial" w:hAnsi="Arial"/>
+                <w:b/>
+                <w:sz w:val="19"/>
+              </w:rPr>
+              <w:t>Nome</w:t>
+            </w:r>
+          </w:p>
+        </w:tc>
+        <w:tc>
+          <w:tcPr>
+            <w:tcW w:type="dxa" w:w="2422"/>
+            <w:vAlign w:val="top"/>
+          </w:tcPr>
+          <w:p>
+            <w:pPr>
+              <w:spacing w:after="0"/>
+            </w:pPr>
+            <w:r>
+              <w:rPr>
+                <w:rFonts w:ascii="Arial" w:hAnsi="Arial"/>
+                <w:sz w:val="19"/>
+              </w:rPr>
+              <w:t>{{ termo.participante.nome }}</w:t>
+            </w:r>
+          </w:p>
+        </w:tc>
+        <w:tc>
+          <w:tcPr>
+            <w:tcW w:type="dxa" w:w="2422"/>
+            <w:vAlign w:val="top"/>
+          </w:tcPr>
+          <w:p>
+            <w:pPr>
+              <w:spacing w:after="0"/>
+            </w:pPr>
+            <w:r>
+              <w:rPr>
+                <w:rFonts w:ascii="Arial" w:hAnsi="Arial"/>
+                <w:b/>
+                <w:sz w:val="19"/>
+              </w:rPr>
+              <w:t>Cargo</w:t>
+            </w:r>
+          </w:p>
+        </w:tc>
+        <w:tc>
+          <w:tcPr>
+            <w:tcW w:type="dxa" w:w="2422"/>
+            <w:vAlign w:val="top"/>
+          </w:tcPr>
+          <w:p>
+            <w:pPr>
+              <w:spacing w:after="0"/>
+            </w:pPr>
+            <w:r>
+              <w:rPr>
+                <w:rFonts w:ascii="Arial" w:hAnsi="Arial"/>
+                <w:sz w:val="19"/>
+              </w:rPr>
+              <w:t>{{ termo.participante.cargo|default("--", true) }}</w:t>
+            </w:r>
+          </w:p>
+        </w:tc>
+      </w:tr>
+      <w:tr>
+        <w:tc>
+          <w:tcPr>
+            <w:tcW w:type="dxa" w:w="2422"/>
+            <w:vAlign w:val="top"/>
+          </w:tcPr>
+          <w:p>
+            <w:pPr>
+              <w:spacing w:after="0"/>
+            </w:pPr>
+            <w:r>
+              <w:rPr>
+                <w:rFonts w:ascii="Arial" w:hAnsi="Arial"/>
+                <w:b/>
+                <w:sz w:val="19"/>
+              </w:rPr>
+              <w:t>RG</w:t>
+            </w:r>
+          </w:p>
+        </w:tc>
+        <w:tc>
+          <w:tcPr>
+            <w:tcW w:type="dxa" w:w="2422"/>
+            <w:vAlign w:val="top"/>
+          </w:tcPr>
+          <w:p>
+            <w:pPr>
+              <w:spacing w:after="0"/>
+            </w:pPr>
+            <w:r>
+              <w:rPr>
+                <w:rFonts w:ascii="Arial" w:hAnsi="Arial"/>
+                <w:sz w:val="19"/>
+              </w:rPr>
+              <w:t>{{ termo.participante.rg_formatado }}</w:t>
+            </w:r>
+          </w:p>
+        </w:tc>
+        <w:tc>
+          <w:tcPr>
+            <w:tcW w:type="dxa" w:w="2422"/>
+            <w:vAlign w:val="top"/>
+          </w:tcPr>
+          <w:p>
+            <w:pPr>
+              <w:spacing w:after="0"/>
+            </w:pPr>
+            <w:r>
+              <w:rPr>
+                <w:rFonts w:ascii="Arial" w:hAnsi="Arial"/>
+                <w:b/>
+                <w:sz w:val="19"/>
+              </w:rPr>
+              <w:t>CPF</w:t>
+            </w:r>
+          </w:p>
+        </w:tc>
+        <w:tc>
+          <w:tcPr>
+            <w:tcW w:type="dxa" w:w="2422"/>
+            <w:vAlign w:val="top"/>
+          </w:tcPr>
+          <w:p>
+            <w:pPr>
+              <w:spacing w:after="0"/>
+            </w:pPr>
+            <w:r>
+              <w:rPr>
+                <w:rFonts w:ascii="Arial" w:hAnsi="Arial"/>
+                <w:sz w:val="19"/>
+              </w:rPr>
+              <w:t>{{ termo.participante.cpf_formatado }}</w:t>
+            </w:r>
+          </w:p>
+        </w:tc>
+      </w:tr>
+      <w:tr>
+        <w:tc>
+          <w:tcPr>
+            <w:tcW w:type="dxa" w:w="2422"/>
+            <w:vAlign w:val="top"/>
+          </w:tcPr>
+          <w:p>
+            <w:pPr>
+              <w:spacing w:after="0"/>
+            </w:pPr>
+            <w:r>
+              <w:rPr>
+                <w:rFonts w:ascii="Arial" w:hAnsi="Arial"/>
+                <w:b/>
+                <w:sz w:val="19"/>
+              </w:rPr>
+              <w:t>Unidade</w:t>
+            </w:r>
+          </w:p>
+        </w:tc>
+        <w:tc>
+          <w:tcPr>
+            <w:tcW w:type="dxa" w:w="2422"/>
+            <w:vAlign w:val="top"/>
+          </w:tcPr>
+          <w:p>
+            <w:pPr>
+              <w:spacing w:after="0"/>
+            </w:pPr>
+            <w:r>
+              <w:rPr>
+                <w:rFonts w:ascii="Arial" w:hAnsi="Arial"/>
+                <w:sz w:val="19"/>
+              </w:rPr>
+              <w:t>{{ termo.participante.unidade|default("--", true) }}</w:t>
+            </w:r>
+          </w:p>
+        </w:tc>
+        <w:tc>
+          <w:tcPr>
+            <w:tcW w:type="dxa" w:w="2422"/>
+            <w:vAlign w:val="top"/>
+          </w:tcPr>
+          <w:p>
+            <w:pPr>
+              <w:spacing w:after="0"/>
+            </w:pPr>
+            <w:r>
+              <w:rPr>
+                <w:rFonts w:ascii="Arial" w:hAnsi="Arial"/>
+                <w:b/>
+                <w:sz w:val="19"/>
+              </w:rPr>
+              <w:t>Telefone</w:t>
+            </w:r>
+          </w:p>
+        </w:tc>
+        <w:tc>
+          <w:tcPr>
+            <w:tcW w:type="dxa" w:w="2422"/>
+            <w:vAlign w:val="top"/>
+          </w:tcPr>
+          <w:p>
+            <w:pPr>
+              <w:spacing w:after="0"/>
+            </w:pPr>
+            <w:r>
+              <w:rPr>
+                <w:rFonts w:ascii="Arial" w:hAnsi="Arial"/>
+                <w:sz w:val="19"/>
+              </w:rPr>
+              <w:t>{{ termo.participante.telefone_formatado }}</w:t>
+            </w:r>
+          </w:p>
+        </w:tc>
+      </w:tr>
+    </w:tbl>
+    <w:p>
+      <w:pPr>
+        <w:spacing w:before="160" w:after="80"/>
+      </w:pPr>
+      <w:r>
+        <w:rPr>
+          <w:rFonts w:ascii="Arial" w:hAnsi="Arial"/>
+          <w:b/>
+          <w:sz w:val="21"/>
+        </w:rPr>
+        <w:t>DADOS DA VIAGEM</w:t>
+      </w:r>
+    </w:p>
+    <w:tbl>
+      <w:tblPr>
+        <w:tblStyle w:val="TableGrid"/>
+        <w:tblW w:type="auto" w:w="0"/>
+        <w:jc w:val="center"/>
+        <w:tblLook w:firstColumn="1" w:firstRow="1" w:lastColumn="0" w:lastRow="0" w:noHBand="0" w:noVBand="1" w:val="04A0"/>
+      </w:tblPr>
+      <w:tblGrid>
+        <w:gridCol w:w="2422"/>
+        <w:gridCol w:w="2422"/>
+        <w:gridCol w:w="2422"/>
+        <w:gridCol w:w="2422"/>
+      </w:tblGrid>
+      <w:tr>
+        <w:tc>
+          <w:tcPr>
+            <w:tcW w:type="dxa" w:w="2422"/>
+            <w:vAlign w:val="top"/>
+          </w:tcPr>
+          <w:p>
+            <w:pPr>
+              <w:spacing w:after="0"/>
+            </w:pPr>
+            <w:r>
+              <w:rPr>
+                <w:rFonts w:ascii="Arial" w:hAnsi="Arial"/>
+                <w:b/>
+                <w:sz w:val="19"/>
+              </w:rPr>
+              <w:t>Destino principal</w:t>
+            </w:r>
+          </w:p>
+        </w:tc>
+        <w:tc>
+          <w:tcPr>
+            <w:tcW w:type="dxa" w:w="2422"/>
+            <w:vAlign w:val="top"/>
+          </w:tcPr>
+          <w:p>
+            <w:pPr>
+              <w:spacing w:after="0"/>
+            </w:pPr>
+            <w:r>
+              <w:rPr>
+                <w:rFonts w:ascii="Arial" w:hAnsi="Arial"/>
+                <w:sz w:val="19"/>
+              </w:rPr>
+              <w:t>{{ termo.viagem.destino_principal }}</w:t>
+            </w:r>
+          </w:p>
+        </w:tc>
+        <w:tc>
+          <w:tcPr>
+            <w:tcW w:type="dxa" w:w="2422"/>
+            <w:vAlign w:val="top"/>
+          </w:tcPr>
+          <w:p>
+            <w:pPr>
+              <w:spacing w:after="0"/>
+            </w:pPr>
+            <w:r>
+              <w:rPr>
+                <w:rFonts w:ascii="Arial" w:hAnsi="Arial"/>
+                <w:b/>
+                <w:sz w:val="19"/>
+              </w:rPr>
+              <w:t>Periodo</w:t>
+            </w:r>
+          </w:p>
+        </w:tc>
+        <w:tc>
+          <w:tcPr>
+            <w:tcW w:type="dxa" w:w="2422"/>
+            <w:vAlign w:val="top"/>
+          </w:tcPr>
+          <w:p>
+            <w:pPr>
+              <w:spacing w:after="0"/>
+            </w:pPr>
+            <w:r>
+              <w:rPr>
+                <w:rFonts w:ascii="Arial" w:hAnsi="Arial"/>
+                <w:sz w:val="19"/>
+              </w:rPr>
+              <w:t>{{ termo.viagem.periodo }}</w:t>
+            </w:r>
+          </w:p>
+        </w:tc>
+      </w:tr>
+      <w:tr>
+        <w:tc>
+          <w:tcPr>
+            <w:tcW w:type="dxa" w:w="2422"/>
+            <w:vAlign w:val="top"/>
+          </w:tcPr>
+          <w:p>
+            <w:pPr>
+              <w:spacing w:after="0"/>
+            </w:pPr>
+            <w:r>
+              <w:rPr>
+                <w:rFonts w:ascii="Arial" w:hAnsi="Arial"/>
+                <w:b/>
+                <w:sz w:val="19"/>
+              </w:rPr>
+              <w:t>Destinos</w:t>
+            </w:r>
+          </w:p>
+        </w:tc>
+        <w:tc>
+          <w:tcPr>
+            <w:tcW w:type="dxa" w:w="2422"/>
+            <w:vAlign w:val="top"/>
+          </w:tcPr>
+          <w:p>
+            <w:pPr>
+              <w:spacing w:after="0"/>
+            </w:pPr>
+            <w:r>
+              <w:rPr>
+                <w:rFonts w:ascii="Arial" w:hAnsi="Arial"/>
+                <w:sz w:val="19"/>
+              </w:rPr>
+              <w:t>{{ termo.viagem.destinos_texto }}</w:t>
+            </w:r>
+          </w:p>
+        </w:tc>
+        <w:tc>
+          <w:tcPr>
+            <w:tcW w:type="dxa" w:w="2422"/>
+            <w:vAlign w:val="top"/>
+          </w:tcPr>
+          <w:p>
+            <w:pPr>
+              <w:spacing w:after="0"/>
+            </w:pPr>
+            <w:r>
+              <w:rPr>
+                <w:rFonts w:ascii="Arial" w:hAnsi="Arial"/>
+                <w:b/>
+                <w:sz w:val="19"/>
+              </w:rPr>
+              <w:t>Diarias</w:t>
+            </w:r>
+          </w:p>
+        </w:tc>
+        <w:tc>
+          <w:tcPr>
+            <w:tcW w:type="dxa" w:w="2422"/>
+            <w:vAlign w:val="top"/>
+          </w:tcPr>
+          <w:p>
+            <w:pPr>
+              <w:spacing w:after="0"/>
+            </w:pPr>
+            <w:r>
+              <w:rPr>
+                <w:rFonts w:ascii="Arial" w:hAnsi="Arial"/>
+                <w:sz w:val="19"/>
+              </w:rPr>
+              <w:t>{{ termo.viagem.quantidade_diarias }}</w:t>
+            </w:r>
+          </w:p>
+        </w:tc>
+      </w:tr>
+      <w:tr>
+        <w:tc>
+          <w:tcPr>
+            <w:tcW w:type="dxa" w:w="2422"/>
+            <w:vAlign w:val="top"/>
+          </w:tcPr>
+          <w:p>
+            <w:pPr>
+              <w:spacing w:after="0"/>
+            </w:pPr>
+            <w:r>
+              <w:rPr>
+                <w:rFonts w:ascii="Arial" w:hAnsi="Arial"/>
+                <w:b/>
+                <w:sz w:val="19"/>
+              </w:rPr>
+              <w:t>Roteiro de ida</w:t>
+            </w:r>
+          </w:p>
+        </w:tc>
+        <w:tc>
+          <w:tcPr>
+            <w:tcW w:type="dxa" w:w="2422"/>
+            <w:vAlign w:val="top"/>
+          </w:tcPr>
+          <w:p>
+            <w:pPr>
+              <w:spacing w:after="0"/>
+            </w:pPr>
+            <w:r>
+              <w:rPr>
+                <w:rFonts w:ascii="Arial" w:hAnsi="Arial"/>
+                <w:sz w:val="19"/>
+              </w:rPr>
+              <w:t>{{ termo.viagem.roteiro_ida_texto }}</w:t>
+            </w:r>
+          </w:p>
+        </w:tc>
+        <w:tc>
+          <w:tcPr>
+            <w:tcW w:type="dxa" w:w="2422"/>
+            <w:vAlign w:val="top"/>
+          </w:tcPr>
+          <w:p>
+            <w:pPr>
+              <w:spacing w:after="0"/>
+            </w:pPr>
+            <w:r>
+              <w:rPr>
+                <w:rFonts w:ascii="Arial" w:hAnsi="Arial"/>
+                <w:b/>
+                <w:sz w:val="19"/>
+              </w:rPr>
+              <w:t>Retorno</w:t>
+            </w:r>
+          </w:p>
+        </w:tc>
+        <w:tc>
+          <w:tcPr>
+            <w:tcW w:type="dxa" w:w="2422"/>
+            <w:vAlign w:val="top"/>
+          </w:tcPr>
+          <w:p>
+            <w:pPr>
+              <w:spacing w:after="0"/>
+            </w:pPr>
+            <w:r>
+              <w:rPr>
+                <w:rFonts w:ascii="Arial" w:hAnsi="Arial"/>
+                <w:sz w:val="19"/>
+              </w:rPr>
+              <w:t>{{ termo.viagem.roteiro_retorno_texto }}</w:t>
+            </w:r>
+          </w:p>
+        </w:tc>
+      </w:tr>
+      <w:tr>
+        <w:tc>
+          <w:tcPr>
+            <w:tcW w:type="dxa" w:w="2422"/>
+            <w:vAlign w:val="top"/>
+          </w:tcPr>
+          <w:p>
+            <w:pPr>
+              <w:spacing w:after="0"/>
+            </w:pPr>
+            <w:r>
+              <w:rPr>
+                <w:rFonts w:ascii="Arial" w:hAnsi="Arial"/>
+                <w:b/>
+                <w:sz w:val="19"/>
+              </w:rPr>
+              <w:t>Valor</w:t>
+            </w:r>
+          </w:p>
+        </w:tc>
+        <w:tc>
+          <w:tcPr>
+            <w:tcW w:type="dxa" w:w="2422"/>
+            <w:vAlign w:val="top"/>
+          </w:tcPr>
+          <w:p>
+            <w:pPr>
+              <w:spacing w:after="0"/>
+            </w:pPr>
+            <w:r>
+              <w:rPr>
+                <w:rFonts w:ascii="Arial" w:hAnsi="Arial"/>
+                <w:sz w:val="19"/>
+              </w:rPr>
+              <w:t>{{ termo.viagem.valor_diarias }}</w:t>
+            </w:r>
+          </w:p>
+        </w:tc>
+        <w:tc>
+          <w:tcPr>
+            <w:tcW w:type="dxa" w:w="2422"/>
+            <w:vAlign w:val="top"/>
+          </w:tcPr>
+          <w:p>
+            <w:pPr>
+              <w:spacing w:after="0"/>
+            </w:pPr>
+            <w:r>
+              <w:rPr>
+                <w:rFonts w:ascii="Arial" w:hAnsi="Arial"/>
+                <w:b/>
+                <w:sz w:val="19"/>
+              </w:rPr>
+              <w:t>Valor por extenso</w:t>
+            </w:r>
+          </w:p>
+        </w:tc>
+        <w:tc>
+          <w:tcPr>
+            <w:tcW w:type="dxa" w:w="2422"/>
+            <w:vAlign w:val="top"/>
+          </w:tcPr>
+          <w:p>
+            <w:pPr>
+              <w:spacing w:after="0"/>
+            </w:pPr>
+            <w:r>
+              <w:rPr>
+                <w:rFonts w:ascii="Arial" w:hAnsi="Arial"/>
+                <w:sz w:val="19"/>
+              </w:rPr>
+              <w:t>{{ termo.viagem.valor_diarias_extenso }}</w:t>
+            </w:r>
+          </w:p>
+        </w:tc>
+      </w:tr>
+    </w:tbl>
+    <w:p>
+      <w:pPr>
+        <w:spacing w:before="120"/>
+      </w:pPr>
+      <w:r>
+        <w:rPr>
+          <w:b/>
+        </w:rPr>
+        <w:t xml:space="preserve">Motivo: </w:t>
+      </w:r>
+      <w:r>
+        <w:t>{{ termo.viagem.motivo }}</w:t>
+      </w:r>
+    </w:p>
+    <w:p>
+      <w:pPr>
+        <w:spacing w:before="160" w:after="80"/>
+      </w:pPr>
+      <w:r>
+        <w:rPr>
+          <w:rFonts w:ascii="Arial" w:hAnsi="Arial"/>
+          <w:b/>
+          <w:sz w:val="21"/>
+        </w:rPr>
+        <w:t>TRANSPORTE</w:t>
+      </w:r>
+    </w:p>
+    <w:tbl>
+      <w:tblPr>
+        <w:tblStyle w:val="TableGrid"/>
+        <w:tblW w:type="auto" w:w="0"/>
+        <w:jc w:val="center"/>
+        <w:tblLook w:firstColumn="1" w:firstRow="1" w:lastColumn="0" w:lastRow="0" w:noHBand="0" w:noVBand="1" w:val="04A0"/>
+      </w:tblPr>
+      <w:tblGrid>
+        <w:gridCol w:w="2422"/>
+        <w:gridCol w:w="2422"/>
+        <w:gridCol w:w="2422"/>
+        <w:gridCol w:w="2422"/>
+      </w:tblGrid>
+      <w:tr>
+        <w:tc>
+          <w:tcPr>
+            <w:tcW w:type="dxa" w:w="2422"/>
+            <w:vAlign w:val="top"/>
+          </w:tcPr>
+          <w:p>
+            <w:pPr>
+              <w:spacing w:after="0"/>
+            </w:pPr>
+            <w:r>
+              <w:rPr>
+                <w:rFonts w:ascii="Arial" w:hAnsi="Arial"/>
+                <w:b/>
+                <w:sz w:val="19"/>
+              </w:rPr>
+              <w:t>Viatura</w:t>
+            </w:r>
+          </w:p>
+        </w:tc>
+        <w:tc>
+          <w:tcPr>
+            <w:tcW w:type="dxa" w:w="2422"/>
+            <w:vAlign w:val="top"/>
+          </w:tcPr>
+          <w:p>
+            <w:pPr>
+              <w:spacing w:after="0"/>
+            </w:pPr>
+            <w:r>
+              <w:rPr>
+                <w:rFonts w:ascii="Arial" w:hAnsi="Arial"/>
+                <w:sz w:val="19"/>
+              </w:rPr>
+              <w:t>{{ "Sim" if termo.transporte.tem_viatura else "Nao" }}</w:t>
+            </w:r>
+          </w:p>
+        </w:tc>
+        <w:tc>
+          <w:tcPr>
+            <w:tcW w:type="dxa" w:w="2422"/>
+            <w:vAlign w:val="top"/>
+          </w:tcPr>
+          <w:p>
+            <w:pPr>
+              <w:spacing w:after="0"/>
+            </w:pPr>
+            <w:r>
+              <w:rPr>
+                <w:rFonts w:ascii="Arial" w:hAnsi="Arial"/>
+                <w:b/>
+                <w:sz w:val="19"/>
+              </w:rPr>
+              <w:t>Placa</w:t>
+            </w:r>
+          </w:p>
+        </w:tc>
+        <w:tc>
+          <w:tcPr>
+            <w:tcW w:type="dxa" w:w="2422"/>
+            <w:vAlign w:val="top"/>
+          </w:tcPr>
+          <w:p>
+            <w:pPr>
+              <w:spacing w:after="0"/>
+            </w:pPr>
+            <w:r>
+              <w:rPr>
+                <w:rFonts w:ascii="Arial" w:hAnsi="Arial"/>
+                <w:sz w:val="19"/>
+              </w:rPr>
+              <w:t>{{ termo.transporte.placa }}</w:t>
+            </w:r>
+          </w:p>
+        </w:tc>
+      </w:tr>
+      <w:tr>
+        <w:tc>
+          <w:tcPr>
+            <w:tcW w:type="dxa" w:w="2422"/>
+            <w:vAlign w:val="top"/>
+          </w:tcPr>
+          <w:p>
+            <w:pPr>
+              <w:spacing w:after="0"/>
+            </w:pPr>
+            <w:r>
+              <w:rPr>
+                <w:rFonts w:ascii="Arial" w:hAnsi="Arial"/>
+                <w:b/>
+                <w:sz w:val="19"/>
+              </w:rPr>
+              <w:t>Modelo</w:t>
+            </w:r>
+          </w:p>
+        </w:tc>
+        <w:tc>
+          <w:tcPr>
+            <w:tcW w:type="dxa" w:w="2422"/>
+            <w:vAlign w:val="top"/>
+          </w:tcPr>
+          <w:p>
+            <w:pPr>
+              <w:spacing w:after="0"/>
+            </w:pPr>
+            <w:r>
+              <w:rPr>
+                <w:rFonts w:ascii="Arial" w:hAnsi="Arial"/>
+                <w:sz w:val="19"/>
+              </w:rPr>
+              <w:t>{{ termo.transporte.modelo }}</w:t>
+            </w:r>
+          </w:p>
+        </w:tc>
+        <w:tc>
+          <w:tcPr>
+            <w:tcW w:type="dxa" w:w="2422"/>
+            <w:vAlign w:val="top"/>
+          </w:tcPr>
+          <w:p>
+            <w:pPr>
+              <w:spacing w:after="0"/>
+            </w:pPr>
+            <w:r>
+              <w:rPr>
+                <w:rFonts w:ascii="Arial" w:hAnsi="Arial"/>
+                <w:b/>
+                <w:sz w:val="19"/>
+              </w:rPr>
+              <w:t>Tipo</w:t>
+            </w:r>
+          </w:p>
+        </w:tc>
+        <w:tc>
+          <w:tcPr>
+            <w:tcW w:type="dxa" w:w="2422"/>
+            <w:vAlign w:val="top"/>
+          </w:tcPr>
+          <w:p>
+            <w:pPr>
+              <w:spacing w:after="0"/>
+            </w:pPr>
+            <w:r>
+              <w:rPr>
+                <w:rFonts w:ascii="Arial" w:hAnsi="Arial"/>
+                <w:sz w:val="19"/>
+              </w:rPr>
+              <w:t>{{ termo.transporte.tipo }}</w:t>
+            </w:r>
+          </w:p>
+        </w:tc>
+      </w:tr>
+      <w:tr>
+        <w:tc>
+          <w:tcPr>
+            <w:tcW w:type="dxa" w:w="2422"/>
+            <w:vAlign w:val="top"/>
+          </w:tcPr>
+          <w:p>
+            <w:pPr>
+              <w:spacing w:after="0"/>
+            </w:pPr>
+            <w:r>
+              <w:rPr>
+                <w:rFonts w:ascii="Arial" w:hAnsi="Arial"/>
+                <w:b/>
+                <w:sz w:val="19"/>
+              </w:rPr>
+              <w:t>Combustivel</w:t>
+            </w:r>
+          </w:p>
+        </w:tc>
+        <w:tc>
+          <w:tcPr>
+            <w:tcW w:type="dxa" w:w="2422"/>
+            <w:vAlign w:val="top"/>
+          </w:tcPr>
+          <w:p>
+            <w:pPr>
+              <w:spacing w:after="0"/>
+            </w:pPr>
+            <w:r>
+              <w:rPr>
+                <w:rFonts w:ascii="Arial" w:hAnsi="Arial"/>
+                <w:sz w:val="19"/>
+              </w:rPr>
+              <w:t>{{ termo.transporte.combustivel }}</w:t>
+            </w:r>
+          </w:p>
+        </w:tc>
+        <w:tc>
+          <w:tcPr>
+            <w:tcW w:type="dxa" w:w="2422"/>
+            <w:vAlign w:val="top"/>
+          </w:tcPr>
+          <w:p>
+            <w:pPr>
+              <w:spacing w:after="0"/>
+            </w:pPr>
+            <w:r>
+              <w:rPr>
+                <w:rFonts w:ascii="Arial" w:hAnsi="Arial"/>
+                <w:b/>
+                <w:sz w:val="19"/>
+              </w:rPr>
+              <w:t>Motorista</w:t>
+            </w:r>
+          </w:p>
+        </w:tc>
+        <w:tc>
+          <w:tcPr>
+            <w:tcW w:type="dxa" w:w="2422"/>
+            <w:vAlign w:val="top"/>
+          </w:tcPr>
+          <w:p>
+            <w:pPr>
+              <w:spacing w:after="0"/>
+            </w:pPr>
+            <w:r>
+              <w:rPr>
+                <w:rFonts w:ascii="Arial" w:hAnsi="Arial"/>
+                <w:sz w:val="19"/>
+              </w:rPr>
+              <w:t>{{ termo.transporte.motorista }}</w:t>
+            </w:r>
+          </w:p>
+        </w:tc>
+      </w:tr>
+      <w:tr>
+        <w:tc>
+          <w:tcPr>
+            <w:tcW w:type="dxa" w:w="2422"/>
+            <w:vAlign w:val="top"/>
+          </w:tcPr>
+          <w:p>
+            <w:pPr>
+              <w:spacing w:after="0"/>
+            </w:pPr>
+            <w:r>
+              <w:rPr>
+                <w:rFonts w:ascii="Arial" w:hAnsi="Arial"/>
+                <w:b/>
+                <w:sz w:val="19"/>
+              </w:rPr>
+              <w:t>Porte/transporte de armas</w:t>
+            </w:r>
+          </w:p>
+        </w:tc>
+        <w:tc>
+          <w:tcPr>
+            <w:tcW w:type="dxa" w:w="2422"/>
+            <w:vAlign w:val="top"/>
+          </w:tcPr>
+          <w:p>
+            <w:pPr>
+              <w:spacing w:after="0"/>
+            </w:pPr>
+            <w:r>
+              <w:rPr>
+                <w:rFonts w:ascii="Arial" w:hAnsi="Arial"/>
+                <w:sz w:val="19"/>
+              </w:rPr>
+              <w:t>{{ termo.transporte.porte_armas }}</w:t>
+            </w:r>
+          </w:p>
+        </w:tc>
+        <w:tc>
+          <w:tcPr>
+            <w:tcW w:type="dxa" w:w="2422"/>
+            <w:vAlign w:val="top"/>
+          </w:tcPr>
+          <w:p>
+            <w:pPr>
+              <w:spacing w:after="0"/>
+            </w:pPr>
+            <w:r>
+              <w:rPr>
+                <w:rFonts w:ascii="Arial" w:hAnsi="Arial"/>
+                <w:b/>
+                <w:sz w:val="19"/>
+              </w:rPr>
+              <w:t>Unidade</w:t>
+            </w:r>
+          </w:p>
+        </w:tc>
+        <w:tc>
+          <w:tcPr>
+            <w:tcW w:type="dxa" w:w="2422"/>
+            <w:vAlign w:val="top"/>
+          </w:tcPr>
+          <w:p>
+            <w:pPr>
+              <w:spacing w:after="0"/>
+            </w:pPr>
+            <w:r>
+              <w:rPr>
+                <w:rFonts w:ascii="Arial" w:hAnsi="Arial"/>
+                <w:sz w:val="19"/>
+              </w:rPr>
+              <w:t>{{ termo.transporte.unidade }}</w:t>
+            </w:r>
+          </w:p>
+        </w:tc>
+      </w:tr>
+    </w:tbl>
+    <w:p>
+      <w:pPr>
+        <w:spacing w:before="160" w:after="80"/>
+      </w:pPr>
+      <w:r>
+        <w:rPr>
+          <w:rFonts w:ascii="Arial" w:hAnsi="Arial"/>
+          <w:b/>
+          <w:sz w:val="21"/>
+        </w:rPr>
+        <w:t>AUTORIZACAO E DECLARACAO</w:t>
+      </w:r>
+    </w:p>
+    <w:p>
+      <w:pPr>
+        <w:jc w:val="both"/>
+      </w:pPr>
+      <w:r>
+        <w:t>{{ termo.textos.corpo_autorizacao }}</w:t>
+      </w:r>
+    </w:p>
+    <w:p>
+      <w:pPr>
+        <w:jc w:val="both"/>
+      </w:pPr>
+      <w:r>
+        <w:t>{{ termo.textos.declaracao }}</w:t>
+      </w:r>
+    </w:p>
+    <w:p>
+      <w:pPr>
+        <w:jc w:val="both"/>
+      </w:pPr>
+      <w:r>
+        <w:t>{% if termo.textos.observacoes and termo.textos.observacoes != "--" %}Observacoes: {{ termo.textos.observacoes }}{% endif %}</w:t>
+      </w:r>
+    </w:p>
+    <w:p>
+      <w:pPr>
+        <w:spacing w:before="440"/>
+        <w:jc w:val="right"/>
+      </w:pPr>
+      <w:r>
+        <w:t>{{ institucional.sede|default(institucional.cidade_endereco|default("Curitiba", true), true) }}, {{ termo.oficio.data_criacao }}.</w:t>
+      </w:r>
+    </w:p>
+    <w:tbl>
+      <w:tblPr>
+        <w:tblW w:type="auto" w:w="0"/>
+        <w:jc w:val="center"/>
+        <w:tblLook w:firstColumn="1" w:firstRow="1" w:lastColumn="0" w:lastRow="0" w:noHBand="0" w:noVBand="1" w:val="04A0"/>
+      </w:tblPr>
+      <w:tblGrid>
+        <w:gridCol w:w="4844"/>
+        <w:gridCol w:w="4844"/>
+      </w:tblGrid>
+      <w:tr>
+        <w:tc>
+          <w:tcPr>
+            <w:tcW w:type="dxa" w:w="4844"/>
+            <w:vAlign w:val="top"/>
+          </w:tcPr>
+          <w:p>
+            <w:pPr>
+              <w:spacing w:before="400"/>
+              <w:jc w:val="center"/>
+            </w:pPr>
+            <w:r>
+              <w:t>____________________________________</w:t>
+            </w:r>
+          </w:p>
+        </w:tc>
+        <w:tc>
+          <w:tcPr>
+            <w:tcW w:type="dxa" w:w="4844"/>
+            <w:vAlign w:val="top"/>
+          </w:tcPr>
+          <w:p>
+            <w:pPr>
+              <w:spacing w:before="400"/>
+              <w:jc w:val="center"/>
+            </w:pPr>
+            <w:r>
+              <w:t>____________________________________</w:t>
+            </w:r>
+          </w:p>
+        </w:tc>
+      </w:tr>
+      <w:tr>
+        <w:tc>
+          <w:tcPr>
+            <w:tcW w:type="dxa" w:w="4844"/>
+            <w:vAlign w:val="top"/>
+          </w:tcPr>
+          <w:p>
+            <w:pPr>
+              <w:spacing w:before="400"/>
+              <w:jc w:val="center"/>
+            </w:pPr>
+            <w:r>
+              <w:t>{{ termo.participante.nome }}</w:t>
+              <w:br/>
+              <w:t>Servidor participante</w:t>
+            </w:r>
+          </w:p>
+        </w:tc>
+        <w:tc>
+          <w:tcPr>
+            <w:tcW w:type="dxa" w:w="4844"/>
+            <w:vAlign w:val="top"/>
+          </w:tcPr>
+          <w:p>
+            <w:pPr>
+              <w:spacing w:before="400"/>
+              <w:jc w:val="center"/>
+            </w:pPr>
+            <w:r>
+              <w:t>{{ institucional.nome_chefia|default("Chefia imediata", true) }}</w:t>
+              <w:br/>
+              <w:t>{{ institucional.cargo_chefia|default("Autoridade competente", true) }}</w:t>
+            </w:r>
+          </w:p>
+        </w:tc>
+      </w:tr>
+    </w:tbl>
     <w:sectPr>
       <w:pgSz w:w="12240" w:h="15840"/>
-      <w:pgMar w:top="1440" w:right="1800" w:bottom="1440" w:left="1800" w:header="720" w:footer="720" w:gutter="0"/>
+      <w:pgMar w:top="1134" w:right="1134" w:bottom="1134" w:left="1417" w:header="720" w:footer="720" w:gutter="0"/>
       <w:cols w:space="720"/>
       <w:docGrid w:linePitch="360"/>
     </w:sectPr>
@@ -390,6 +1752,10 @@
     <w:name w:val="Normal"/>
     <w:qFormat/>
     <w:rsid w:val="00FC693F"/>
+    <w:rPr>
+      <w:rFonts w:ascii="Arial" w:hAnsi="Arial"/>
+      <w:sz w:val="21"/>
+    </w:rPr>
   </w:style>
   <w:style w:type="paragraph" w:styleId="Header">
     <w:name w:val="header"/>

</xml_diff>